<commit_message>
Add official Opta MW6 figures and Opta-versus-our-forecast comparison
Records the Opta Analyst Matchday 6 graphic as mw6.csv, confirms that
29 of 30 search-sourced Opta figures matched it, and adds a side-by-side
table of Opta's Method 1 and Method 2 calls against the blended forecast.

Co-Authored-By: Claude Opus 5.5 <noreply@anthropic.com>
Claude-Session: https://claude.ai/code/session_015L31YyoTUT5JUFyXoY78fY
</commit_message>
<xml_diff>
--- a/analysis/epl-2026-27/EPL_2026-27_Prediction_Accuracy_and_MW6_Forecast.docx
+++ b/analysis/epl-2026-27/EPL_2026-27_Prediction_Accuracy_and_MW6_Forecast.docx
@@ -511,7 +511,7 @@
           <w:sz w:val="20"/>
           <w:szCs w:val="20"/>
         </w:rPr>
-        <w:t xml:space="preserve">This environment's network policy blocked direct access to theanalyst.com, premierleague.com, the Wayback Machine and most news sites. All Opta figures were obtained through search-engine summaries of those pages rather than the pages themselves, so transcription errors are possible.</w:t>
+        <w:t xml:space="preserve">This environment's network policy blocked direct access to theanalyst.com, premierleague.com, the Wayback Machine and most news sites. All Opta figures were obtained through search-engine summaries of those pages rather than the pages themselves, so transcription errors are possible. As a check, the same search-based method was used to collect Opta's Matchweek 6 figures before the official Opta graphic was available: 29 of the 30 figures matched the graphic exactly, and the one difference was a derived draw that was out by 0.1 points. This gives reasonable confidence in the Matchweek 1 to 5 figures.</w:t>
       </w:r>
     </w:p>
     <w:p>
@@ -7160,6 +7160,2231 @@
           <w:szCs w:val="18"/>
         </w:rPr>
         <w:t xml:space="preserve">Draws called: 3 of 10. Model expected goals and source-by-source probabilities are in the appendix.</w:t>
+      </w:r>
+    </w:p>
+    <w:p>
+      <w:pPr>
+        <w:pStyle w:val="Heading2"/>
+        <w:spacing w:after="80" w:before="200"/>
+      </w:pPr>
+      <w:r>
+        <w:rPr>
+          <w:rFonts w:ascii="Open Sans" w:cs="Open Sans" w:eastAsia="Open Sans" w:hAnsi="Open Sans"/>
+          <w:b/>
+          <w:bCs/>
+          <w:color w:val="093D58"/>
+          <w:sz w:val="24"/>
+          <w:szCs w:val="24"/>
+        </w:rPr>
+        <w:t xml:space="preserve">Our calls against Opta's</w:t>
+      </w:r>
+    </w:p>
+    <w:p>
+      <w:pPr>
+        <w:spacing w:after="120" w:before="0" w:line="276"/>
+      </w:pPr>
+      <w:r>
+        <w:rPr>
+          <w:rFonts w:ascii="Open Sans" w:cs="Open Sans" w:eastAsia="Open Sans" w:hAnsi="Open Sans"/>
+          <w:color w:val="333C46"/>
+          <w:sz w:val="20"/>
+          <w:szCs w:val="20"/>
+        </w:rPr>
+        <w:t xml:space="preserve">Opta's figures below are taken from the official Opta Analyst Matchday 6 graphic. Applying both scoring methods to them lets the two forecasts be tracked side by side once the results are in.</w:t>
+      </w:r>
+    </w:p>
+    <w:tbl>
+      <w:tblPr>
+        <w:tblW w:type="dxa" w:w="9638"/>
+        <w:tblBorders>
+          <w:top w:val="single" w:color="auto" w:sz="4"/>
+          <w:left w:val="single" w:color="auto" w:sz="4"/>
+          <w:bottom w:val="single" w:color="auto" w:sz="4"/>
+          <w:right w:val="single" w:color="auto" w:sz="4"/>
+          <w:insideH w:val="single" w:color="auto" w:sz="4"/>
+          <w:insideV w:val="single" w:color="auto" w:sz="4"/>
+        </w:tblBorders>
+        <w:tblLayout w:type="fixed"/>
+      </w:tblPr>
+      <w:tblGrid>
+        <w:gridCol w:w="2838"/>
+        <w:gridCol w:w="1800"/>
+        <w:gridCol w:w="1000"/>
+        <w:gridCol w:w="1000"/>
+        <w:gridCol w:w="1700"/>
+        <w:gridCol w:w="1300"/>
+      </w:tblGrid>
+      <w:tr>
+        <w:trPr>
+          <w:tblHeader/>
+        </w:trPr>
+        <w:tc>
+          <w:tcPr>
+            <w:tcW w:type="dxa" w:w="2838"/>
+            <w:tcBorders>
+              <w:top w:val="single" w:color="D0D3D6" w:sz="4"/>
+              <w:left w:val="single" w:color="D0D3D6" w:sz="4"/>
+              <w:bottom w:val="single" w:color="D0D3D6" w:sz="4"/>
+              <w:right w:val="single" w:color="D0D3D6" w:sz="4"/>
+            </w:tcBorders>
+            <w:shd w:fill="093D58" w:color="auto" w:val="clear"/>
+            <w:tcMar>
+              <w:top w:type="dxa" w:w="50"/>
+              <w:left w:type="dxa" w:w="80"/>
+              <w:bottom w:type="dxa" w:w="50"/>
+              <w:right w:type="dxa" w:w="80"/>
+            </w:tcMar>
+          </w:tcPr>
+          <w:p>
+            <w:pPr>
+              <w:jc w:val="left"/>
+            </w:pPr>
+            <w:r>
+              <w:rPr>
+                <w:rFonts w:ascii="Open Sans" w:cs="Open Sans" w:eastAsia="Open Sans" w:hAnsi="Open Sans"/>
+                <w:b/>
+                <w:bCs/>
+                <w:color w:val="FFFFFF"/>
+                <w:sz w:val="16"/>
+                <w:szCs w:val="16"/>
+              </w:rPr>
+              <w:t xml:space="preserve">Fixture</w:t>
+            </w:r>
+          </w:p>
+        </w:tc>
+        <w:tc>
+          <w:tcPr>
+            <w:tcW w:type="dxa" w:w="1800"/>
+            <w:tcBorders>
+              <w:top w:val="single" w:color="D0D3D6" w:sz="4"/>
+              <w:left w:val="single" w:color="D0D3D6" w:sz="4"/>
+              <w:bottom w:val="single" w:color="D0D3D6" w:sz="4"/>
+              <w:right w:val="single" w:color="D0D3D6" w:sz="4"/>
+            </w:tcBorders>
+            <w:shd w:fill="093D58" w:color="auto" w:val="clear"/>
+            <w:tcMar>
+              <w:top w:type="dxa" w:w="50"/>
+              <w:left w:type="dxa" w:w="80"/>
+              <w:bottom w:type="dxa" w:w="50"/>
+              <w:right w:type="dxa" w:w="80"/>
+            </w:tcMar>
+          </w:tcPr>
+          <w:p>
+            <w:pPr>
+              <w:jc w:val="center"/>
+            </w:pPr>
+            <w:r>
+              <w:rPr>
+                <w:rFonts w:ascii="Open Sans" w:cs="Open Sans" w:eastAsia="Open Sans" w:hAnsi="Open Sans"/>
+                <w:b/>
+                <w:bCs/>
+                <w:color w:val="FFFFFF"/>
+                <w:sz w:val="16"/>
+                <w:szCs w:val="16"/>
+              </w:rPr>
+              <w:t xml:space="preserve">Opta H / D / A</w:t>
+            </w:r>
+          </w:p>
+        </w:tc>
+        <w:tc>
+          <w:tcPr>
+            <w:tcW w:type="dxa" w:w="1000"/>
+            <w:tcBorders>
+              <w:top w:val="single" w:color="D0D3D6" w:sz="4"/>
+              <w:left w:val="single" w:color="D0D3D6" w:sz="4"/>
+              <w:bottom w:val="single" w:color="D0D3D6" w:sz="4"/>
+              <w:right w:val="single" w:color="D0D3D6" w:sz="4"/>
+            </w:tcBorders>
+            <w:shd w:fill="093D58" w:color="auto" w:val="clear"/>
+            <w:tcMar>
+              <w:top w:type="dxa" w:w="50"/>
+              <w:left w:type="dxa" w:w="80"/>
+              <w:bottom w:type="dxa" w:w="50"/>
+              <w:right w:type="dxa" w:w="80"/>
+            </w:tcMar>
+          </w:tcPr>
+          <w:p>
+            <w:pPr>
+              <w:jc w:val="center"/>
+            </w:pPr>
+            <w:r>
+              <w:rPr>
+                <w:rFonts w:ascii="Open Sans" w:cs="Open Sans" w:eastAsia="Open Sans" w:hAnsi="Open Sans"/>
+                <w:b/>
+                <w:bCs/>
+                <w:color w:val="FFFFFF"/>
+                <w:sz w:val="16"/>
+                <w:szCs w:val="16"/>
+              </w:rPr>
+              <w:t xml:space="preserve">Opta M1</w:t>
+            </w:r>
+          </w:p>
+        </w:tc>
+        <w:tc>
+          <w:tcPr>
+            <w:tcW w:type="dxa" w:w="1000"/>
+            <w:tcBorders>
+              <w:top w:val="single" w:color="D0D3D6" w:sz="4"/>
+              <w:left w:val="single" w:color="D0D3D6" w:sz="4"/>
+              <w:bottom w:val="single" w:color="D0D3D6" w:sz="4"/>
+              <w:right w:val="single" w:color="D0D3D6" w:sz="4"/>
+            </w:tcBorders>
+            <w:shd w:fill="093D58" w:color="auto" w:val="clear"/>
+            <w:tcMar>
+              <w:top w:type="dxa" w:w="50"/>
+              <w:left w:type="dxa" w:w="80"/>
+              <w:bottom w:type="dxa" w:w="50"/>
+              <w:right w:type="dxa" w:w="80"/>
+            </w:tcMar>
+          </w:tcPr>
+          <w:p>
+            <w:pPr>
+              <w:jc w:val="center"/>
+            </w:pPr>
+            <w:r>
+              <w:rPr>
+                <w:rFonts w:ascii="Open Sans" w:cs="Open Sans" w:eastAsia="Open Sans" w:hAnsi="Open Sans"/>
+                <w:b/>
+                <w:bCs/>
+                <w:color w:val="FFFFFF"/>
+                <w:sz w:val="16"/>
+                <w:szCs w:val="16"/>
+              </w:rPr>
+              <w:t xml:space="preserve">Opta M2</w:t>
+            </w:r>
+          </w:p>
+        </w:tc>
+        <w:tc>
+          <w:tcPr>
+            <w:tcW w:type="dxa" w:w="1700"/>
+            <w:tcBorders>
+              <w:top w:val="single" w:color="D0D3D6" w:sz="4"/>
+              <w:left w:val="single" w:color="D0D3D6" w:sz="4"/>
+              <w:bottom w:val="single" w:color="D0D3D6" w:sz="4"/>
+              <w:right w:val="single" w:color="D0D3D6" w:sz="4"/>
+            </w:tcBorders>
+            <w:shd w:fill="093D58" w:color="auto" w:val="clear"/>
+            <w:tcMar>
+              <w:top w:type="dxa" w:w="50"/>
+              <w:left w:type="dxa" w:w="80"/>
+              <w:bottom w:type="dxa" w:w="50"/>
+              <w:right w:type="dxa" w:w="80"/>
+            </w:tcMar>
+          </w:tcPr>
+          <w:p>
+            <w:pPr>
+              <w:jc w:val="center"/>
+            </w:pPr>
+            <w:r>
+              <w:rPr>
+                <w:rFonts w:ascii="Open Sans" w:cs="Open Sans" w:eastAsia="Open Sans" w:hAnsi="Open Sans"/>
+                <w:b/>
+                <w:bCs/>
+                <w:color w:val="FFFFFF"/>
+                <w:sz w:val="16"/>
+                <w:szCs w:val="16"/>
+              </w:rPr>
+              <w:t xml:space="preserve">Our call</w:t>
+            </w:r>
+          </w:p>
+        </w:tc>
+        <w:tc>
+          <w:tcPr>
+            <w:tcW w:type="dxa" w:w="1300"/>
+            <w:tcBorders>
+              <w:top w:val="single" w:color="D0D3D6" w:sz="4"/>
+              <w:left w:val="single" w:color="D0D3D6" w:sz="4"/>
+              <w:bottom w:val="single" w:color="D0D3D6" w:sz="4"/>
+              <w:right w:val="single" w:color="D0D3D6" w:sz="4"/>
+            </w:tcBorders>
+            <w:shd w:fill="093D58" w:color="auto" w:val="clear"/>
+            <w:tcMar>
+              <w:top w:type="dxa" w:w="50"/>
+              <w:left w:type="dxa" w:w="80"/>
+              <w:bottom w:type="dxa" w:w="50"/>
+              <w:right w:type="dxa" w:w="80"/>
+            </w:tcMar>
+          </w:tcPr>
+          <w:p>
+            <w:pPr>
+              <w:jc w:val="center"/>
+            </w:pPr>
+            <w:r>
+              <w:rPr>
+                <w:rFonts w:ascii="Open Sans" w:cs="Open Sans" w:eastAsia="Open Sans" w:hAnsi="Open Sans"/>
+                <w:b/>
+                <w:bCs/>
+                <w:color w:val="FFFFFF"/>
+                <w:sz w:val="16"/>
+                <w:szCs w:val="16"/>
+              </w:rPr>
+              <w:t xml:space="preserve">Same?</w:t>
+            </w:r>
+          </w:p>
+        </w:tc>
+      </w:tr>
+      <w:tr>
+        <w:tc>
+          <w:tcPr>
+            <w:tcW w:type="dxa" w:w="2838"/>
+            <w:tcBorders>
+              <w:top w:val="single" w:color="D0D3D6" w:sz="4"/>
+              <w:left w:val="single" w:color="D0D3D6" w:sz="4"/>
+              <w:bottom w:val="single" w:color="D0D3D6" w:sz="4"/>
+              <w:right w:val="single" w:color="D0D3D6" w:sz="4"/>
+            </w:tcBorders>
+            <w:tcMar>
+              <w:top w:type="dxa" w:w="50"/>
+              <w:left w:type="dxa" w:w="80"/>
+              <w:bottom w:type="dxa" w:w="50"/>
+              <w:right w:type="dxa" w:w="80"/>
+            </w:tcMar>
+          </w:tcPr>
+          <w:p>
+            <w:pPr>
+              <w:jc w:val="left"/>
+            </w:pPr>
+            <w:r>
+              <w:rPr>
+                <w:rFonts w:ascii="Open Sans" w:cs="Open Sans" w:eastAsia="Open Sans" w:hAnsi="Open Sans"/>
+                <w:color w:val="333C46"/>
+                <w:sz w:val="16"/>
+                <w:szCs w:val="16"/>
+              </w:rPr>
+              <w:t xml:space="preserve">Arsenal v Leeds</w:t>
+            </w:r>
+          </w:p>
+        </w:tc>
+        <w:tc>
+          <w:tcPr>
+            <w:tcW w:type="dxa" w:w="1800"/>
+            <w:tcBorders>
+              <w:top w:val="single" w:color="D0D3D6" w:sz="4"/>
+              <w:left w:val="single" w:color="D0D3D6" w:sz="4"/>
+              <w:bottom w:val="single" w:color="D0D3D6" w:sz="4"/>
+              <w:right w:val="single" w:color="D0D3D6" w:sz="4"/>
+            </w:tcBorders>
+            <w:tcMar>
+              <w:top w:type="dxa" w:w="50"/>
+              <w:left w:type="dxa" w:w="80"/>
+              <w:bottom w:type="dxa" w:w="50"/>
+              <w:right w:type="dxa" w:w="80"/>
+            </w:tcMar>
+          </w:tcPr>
+          <w:p>
+            <w:pPr>
+              <w:jc w:val="center"/>
+            </w:pPr>
+            <w:r>
+              <w:rPr>
+                <w:rFonts w:ascii="Open Sans" w:cs="Open Sans" w:eastAsia="Open Sans" w:hAnsi="Open Sans"/>
+                <w:color w:val="333C46"/>
+                <w:sz w:val="16"/>
+                <w:szCs w:val="16"/>
+              </w:rPr>
+              <w:t xml:space="preserve">68.9 / 17.4 / 13.7</w:t>
+            </w:r>
+          </w:p>
+        </w:tc>
+        <w:tc>
+          <w:tcPr>
+            <w:tcW w:type="dxa" w:w="1000"/>
+            <w:tcBorders>
+              <w:top w:val="single" w:color="D0D3D6" w:sz="4"/>
+              <w:left w:val="single" w:color="D0D3D6" w:sz="4"/>
+              <w:bottom w:val="single" w:color="D0D3D6" w:sz="4"/>
+              <w:right w:val="single" w:color="D0D3D6" w:sz="4"/>
+            </w:tcBorders>
+            <w:tcMar>
+              <w:top w:type="dxa" w:w="50"/>
+              <w:left w:type="dxa" w:w="80"/>
+              <w:bottom w:type="dxa" w:w="50"/>
+              <w:right w:type="dxa" w:w="80"/>
+            </w:tcMar>
+          </w:tcPr>
+          <w:p>
+            <w:pPr>
+              <w:jc w:val="center"/>
+            </w:pPr>
+            <w:r>
+              <w:rPr>
+                <w:rFonts w:ascii="Open Sans" w:cs="Open Sans" w:eastAsia="Open Sans" w:hAnsi="Open Sans"/>
+                <w:color w:val="333C46"/>
+                <w:sz w:val="16"/>
+                <w:szCs w:val="16"/>
+              </w:rPr>
+              <w:t xml:space="preserve">Home</w:t>
+            </w:r>
+          </w:p>
+        </w:tc>
+        <w:tc>
+          <w:tcPr>
+            <w:tcW w:type="dxa" w:w="1000"/>
+            <w:tcBorders>
+              <w:top w:val="single" w:color="D0D3D6" w:sz="4"/>
+              <w:left w:val="single" w:color="D0D3D6" w:sz="4"/>
+              <w:bottom w:val="single" w:color="D0D3D6" w:sz="4"/>
+              <w:right w:val="single" w:color="D0D3D6" w:sz="4"/>
+            </w:tcBorders>
+            <w:tcMar>
+              <w:top w:type="dxa" w:w="50"/>
+              <w:left w:type="dxa" w:w="80"/>
+              <w:bottom w:type="dxa" w:w="50"/>
+              <w:right w:type="dxa" w:w="80"/>
+            </w:tcMar>
+          </w:tcPr>
+          <w:p>
+            <w:pPr>
+              <w:jc w:val="center"/>
+            </w:pPr>
+            <w:r>
+              <w:rPr>
+                <w:rFonts w:ascii="Open Sans" w:cs="Open Sans" w:eastAsia="Open Sans" w:hAnsi="Open Sans"/>
+                <w:color w:val="333C46"/>
+                <w:sz w:val="16"/>
+                <w:szCs w:val="16"/>
+              </w:rPr>
+              <w:t xml:space="preserve">Home</w:t>
+            </w:r>
+          </w:p>
+        </w:tc>
+        <w:tc>
+          <w:tcPr>
+            <w:tcW w:type="dxa" w:w="1700"/>
+            <w:tcBorders>
+              <w:top w:val="single" w:color="D0D3D6" w:sz="4"/>
+              <w:left w:val="single" w:color="D0D3D6" w:sz="4"/>
+              <w:bottom w:val="single" w:color="D0D3D6" w:sz="4"/>
+              <w:right w:val="single" w:color="D0D3D6" w:sz="4"/>
+            </w:tcBorders>
+            <w:tcMar>
+              <w:top w:type="dxa" w:w="50"/>
+              <w:left w:type="dxa" w:w="80"/>
+              <w:bottom w:type="dxa" w:w="50"/>
+              <w:right w:type="dxa" w:w="80"/>
+            </w:tcMar>
+          </w:tcPr>
+          <w:p>
+            <w:pPr>
+              <w:jc w:val="center"/>
+            </w:pPr>
+            <w:r>
+              <w:rPr>
+                <w:rFonts w:ascii="Open Sans" w:cs="Open Sans" w:eastAsia="Open Sans" w:hAnsi="Open Sans"/>
+                <w:b/>
+                <w:bCs/>
+                <w:color w:val="333C46"/>
+                <w:sz w:val="16"/>
+                <w:szCs w:val="16"/>
+              </w:rPr>
+              <w:t xml:space="preserve">Home 1-0</w:t>
+            </w:r>
+          </w:p>
+        </w:tc>
+        <w:tc>
+          <w:tcPr>
+            <w:tcW w:type="dxa" w:w="1300"/>
+            <w:tcBorders>
+              <w:top w:val="single" w:color="D0D3D6" w:sz="4"/>
+              <w:left w:val="single" w:color="D0D3D6" w:sz="4"/>
+              <w:bottom w:val="single" w:color="D0D3D6" w:sz="4"/>
+              <w:right w:val="single" w:color="D0D3D6" w:sz="4"/>
+            </w:tcBorders>
+            <w:shd w:fill="E3F6EC" w:color="auto" w:val="clear"/>
+            <w:tcMar>
+              <w:top w:type="dxa" w:w="50"/>
+              <w:left w:type="dxa" w:w="80"/>
+              <w:bottom w:type="dxa" w:w="50"/>
+              <w:right w:type="dxa" w:w="80"/>
+            </w:tcMar>
+          </w:tcPr>
+          <w:p>
+            <w:pPr>
+              <w:jc w:val="center"/>
+            </w:pPr>
+            <w:r>
+              <w:rPr>
+                <w:rFonts w:ascii="Open Sans" w:cs="Open Sans" w:eastAsia="Open Sans" w:hAnsi="Open Sans"/>
+                <w:color w:val="333C46"/>
+                <w:sz w:val="16"/>
+                <w:szCs w:val="16"/>
+              </w:rPr>
+              <w:t xml:space="preserve">Yes</w:t>
+            </w:r>
+          </w:p>
+        </w:tc>
+      </w:tr>
+      <w:tr>
+        <w:tc>
+          <w:tcPr>
+            <w:tcW w:type="dxa" w:w="2838"/>
+            <w:tcBorders>
+              <w:top w:val="single" w:color="D0D3D6" w:sz="4"/>
+              <w:left w:val="single" w:color="D0D3D6" w:sz="4"/>
+              <w:bottom w:val="single" w:color="D0D3D6" w:sz="4"/>
+              <w:right w:val="single" w:color="D0D3D6" w:sz="4"/>
+            </w:tcBorders>
+            <w:shd w:fill="F6F8FA" w:color="auto" w:val="clear"/>
+            <w:tcMar>
+              <w:top w:type="dxa" w:w="50"/>
+              <w:left w:type="dxa" w:w="80"/>
+              <w:bottom w:type="dxa" w:w="50"/>
+              <w:right w:type="dxa" w:w="80"/>
+            </w:tcMar>
+          </w:tcPr>
+          <w:p>
+            <w:pPr>
+              <w:jc w:val="left"/>
+            </w:pPr>
+            <w:r>
+              <w:rPr>
+                <w:rFonts w:ascii="Open Sans" w:cs="Open Sans" w:eastAsia="Open Sans" w:hAnsi="Open Sans"/>
+                <w:color w:val="333C46"/>
+                <w:sz w:val="16"/>
+                <w:szCs w:val="16"/>
+              </w:rPr>
+              <w:t xml:space="preserve">Sunderland v Brighton</w:t>
+            </w:r>
+          </w:p>
+        </w:tc>
+        <w:tc>
+          <w:tcPr>
+            <w:tcW w:type="dxa" w:w="1800"/>
+            <w:tcBorders>
+              <w:top w:val="single" w:color="D0D3D6" w:sz="4"/>
+              <w:left w:val="single" w:color="D0D3D6" w:sz="4"/>
+              <w:bottom w:val="single" w:color="D0D3D6" w:sz="4"/>
+              <w:right w:val="single" w:color="D0D3D6" w:sz="4"/>
+            </w:tcBorders>
+            <w:shd w:fill="F6F8FA" w:color="auto" w:val="clear"/>
+            <w:tcMar>
+              <w:top w:type="dxa" w:w="50"/>
+              <w:left w:type="dxa" w:w="80"/>
+              <w:bottom w:type="dxa" w:w="50"/>
+              <w:right w:type="dxa" w:w="80"/>
+            </w:tcMar>
+          </w:tcPr>
+          <w:p>
+            <w:pPr>
+              <w:jc w:val="center"/>
+            </w:pPr>
+            <w:r>
+              <w:rPr>
+                <w:rFonts w:ascii="Open Sans" w:cs="Open Sans" w:eastAsia="Open Sans" w:hAnsi="Open Sans"/>
+                <w:color w:val="333C46"/>
+                <w:sz w:val="16"/>
+                <w:szCs w:val="16"/>
+              </w:rPr>
+              <w:t xml:space="preserve">33.1 / 25.6 / 41.3</w:t>
+            </w:r>
+          </w:p>
+        </w:tc>
+        <w:tc>
+          <w:tcPr>
+            <w:tcW w:type="dxa" w:w="1000"/>
+            <w:tcBorders>
+              <w:top w:val="single" w:color="D0D3D6" w:sz="4"/>
+              <w:left w:val="single" w:color="D0D3D6" w:sz="4"/>
+              <w:bottom w:val="single" w:color="D0D3D6" w:sz="4"/>
+              <w:right w:val="single" w:color="D0D3D6" w:sz="4"/>
+            </w:tcBorders>
+            <w:shd w:fill="F6F8FA" w:color="auto" w:val="clear"/>
+            <w:tcMar>
+              <w:top w:type="dxa" w:w="50"/>
+              <w:left w:type="dxa" w:w="80"/>
+              <w:bottom w:type="dxa" w:w="50"/>
+              <w:right w:type="dxa" w:w="80"/>
+            </w:tcMar>
+          </w:tcPr>
+          <w:p>
+            <w:pPr>
+              <w:jc w:val="center"/>
+            </w:pPr>
+            <w:r>
+              <w:rPr>
+                <w:rFonts w:ascii="Open Sans" w:cs="Open Sans" w:eastAsia="Open Sans" w:hAnsi="Open Sans"/>
+                <w:color w:val="333C46"/>
+                <w:sz w:val="16"/>
+                <w:szCs w:val="16"/>
+              </w:rPr>
+              <w:t xml:space="preserve">Away</w:t>
+            </w:r>
+          </w:p>
+        </w:tc>
+        <w:tc>
+          <w:tcPr>
+            <w:tcW w:type="dxa" w:w="1000"/>
+            <w:tcBorders>
+              <w:top w:val="single" w:color="D0D3D6" w:sz="4"/>
+              <w:left w:val="single" w:color="D0D3D6" w:sz="4"/>
+              <w:bottom w:val="single" w:color="D0D3D6" w:sz="4"/>
+              <w:right w:val="single" w:color="D0D3D6" w:sz="4"/>
+            </w:tcBorders>
+            <w:shd w:fill="F6F8FA" w:color="auto" w:val="clear"/>
+            <w:tcMar>
+              <w:top w:type="dxa" w:w="50"/>
+              <w:left w:type="dxa" w:w="80"/>
+              <w:bottom w:type="dxa" w:w="50"/>
+              <w:right w:type="dxa" w:w="80"/>
+            </w:tcMar>
+          </w:tcPr>
+          <w:p>
+            <w:pPr>
+              <w:jc w:val="center"/>
+            </w:pPr>
+            <w:r>
+              <w:rPr>
+                <w:rFonts w:ascii="Open Sans" w:cs="Open Sans" w:eastAsia="Open Sans" w:hAnsi="Open Sans"/>
+                <w:color w:val="333C46"/>
+                <w:sz w:val="16"/>
+                <w:szCs w:val="16"/>
+              </w:rPr>
+              <w:t xml:space="preserve">Away</w:t>
+            </w:r>
+          </w:p>
+        </w:tc>
+        <w:tc>
+          <w:tcPr>
+            <w:tcW w:type="dxa" w:w="1700"/>
+            <w:tcBorders>
+              <w:top w:val="single" w:color="D0D3D6" w:sz="4"/>
+              <w:left w:val="single" w:color="D0D3D6" w:sz="4"/>
+              <w:bottom w:val="single" w:color="D0D3D6" w:sz="4"/>
+              <w:right w:val="single" w:color="D0D3D6" w:sz="4"/>
+            </w:tcBorders>
+            <w:shd w:fill="F6F8FA" w:color="auto" w:val="clear"/>
+            <w:tcMar>
+              <w:top w:type="dxa" w:w="50"/>
+              <w:left w:type="dxa" w:w="80"/>
+              <w:bottom w:type="dxa" w:w="50"/>
+              <w:right w:type="dxa" w:w="80"/>
+            </w:tcMar>
+          </w:tcPr>
+          <w:p>
+            <w:pPr>
+              <w:jc w:val="center"/>
+            </w:pPr>
+            <w:r>
+              <w:rPr>
+                <w:rFonts w:ascii="Open Sans" w:cs="Open Sans" w:eastAsia="Open Sans" w:hAnsi="Open Sans"/>
+                <w:b/>
+                <w:bCs/>
+                <w:color w:val="333C46"/>
+                <w:sz w:val="16"/>
+                <w:szCs w:val="16"/>
+              </w:rPr>
+              <w:t xml:space="preserve">Away 1-2</w:t>
+            </w:r>
+          </w:p>
+        </w:tc>
+        <w:tc>
+          <w:tcPr>
+            <w:tcW w:type="dxa" w:w="1300"/>
+            <w:tcBorders>
+              <w:top w:val="single" w:color="D0D3D6" w:sz="4"/>
+              <w:left w:val="single" w:color="D0D3D6" w:sz="4"/>
+              <w:bottom w:val="single" w:color="D0D3D6" w:sz="4"/>
+              <w:right w:val="single" w:color="D0D3D6" w:sz="4"/>
+            </w:tcBorders>
+            <w:shd w:fill="E3F6EC" w:color="auto" w:val="clear"/>
+            <w:tcMar>
+              <w:top w:type="dxa" w:w="50"/>
+              <w:left w:type="dxa" w:w="80"/>
+              <w:bottom w:type="dxa" w:w="50"/>
+              <w:right w:type="dxa" w:w="80"/>
+            </w:tcMar>
+          </w:tcPr>
+          <w:p>
+            <w:pPr>
+              <w:jc w:val="center"/>
+            </w:pPr>
+            <w:r>
+              <w:rPr>
+                <w:rFonts w:ascii="Open Sans" w:cs="Open Sans" w:eastAsia="Open Sans" w:hAnsi="Open Sans"/>
+                <w:color w:val="333C46"/>
+                <w:sz w:val="16"/>
+                <w:szCs w:val="16"/>
+              </w:rPr>
+              <w:t xml:space="preserve">Yes</w:t>
+            </w:r>
+          </w:p>
+        </w:tc>
+      </w:tr>
+      <w:tr>
+        <w:tc>
+          <w:tcPr>
+            <w:tcW w:type="dxa" w:w="2838"/>
+            <w:tcBorders>
+              <w:top w:val="single" w:color="D0D3D6" w:sz="4"/>
+              <w:left w:val="single" w:color="D0D3D6" w:sz="4"/>
+              <w:bottom w:val="single" w:color="D0D3D6" w:sz="4"/>
+              <w:right w:val="single" w:color="D0D3D6" w:sz="4"/>
+            </w:tcBorders>
+            <w:tcMar>
+              <w:top w:type="dxa" w:w="50"/>
+              <w:left w:type="dxa" w:w="80"/>
+              <w:bottom w:type="dxa" w:w="50"/>
+              <w:right w:type="dxa" w:w="80"/>
+            </w:tcMar>
+          </w:tcPr>
+          <w:p>
+            <w:pPr>
+              <w:jc w:val="left"/>
+            </w:pPr>
+            <w:r>
+              <w:rPr>
+                <w:rFonts w:ascii="Open Sans" w:cs="Open Sans" w:eastAsia="Open Sans" w:hAnsi="Open Sans"/>
+                <w:color w:val="333C46"/>
+                <w:sz w:val="16"/>
+                <w:szCs w:val="16"/>
+              </w:rPr>
+              <w:t xml:space="preserve">Chelsea v Bournemouth</w:t>
+            </w:r>
+          </w:p>
+        </w:tc>
+        <w:tc>
+          <w:tcPr>
+            <w:tcW w:type="dxa" w:w="1800"/>
+            <w:tcBorders>
+              <w:top w:val="single" w:color="D0D3D6" w:sz="4"/>
+              <w:left w:val="single" w:color="D0D3D6" w:sz="4"/>
+              <w:bottom w:val="single" w:color="D0D3D6" w:sz="4"/>
+              <w:right w:val="single" w:color="D0D3D6" w:sz="4"/>
+            </w:tcBorders>
+            <w:tcMar>
+              <w:top w:type="dxa" w:w="50"/>
+              <w:left w:type="dxa" w:w="80"/>
+              <w:bottom w:type="dxa" w:w="50"/>
+              <w:right w:type="dxa" w:w="80"/>
+            </w:tcMar>
+          </w:tcPr>
+          <w:p>
+            <w:pPr>
+              <w:jc w:val="center"/>
+            </w:pPr>
+            <w:r>
+              <w:rPr>
+                <w:rFonts w:ascii="Open Sans" w:cs="Open Sans" w:eastAsia="Open Sans" w:hAnsi="Open Sans"/>
+                <w:color w:val="333C46"/>
+                <w:sz w:val="16"/>
+                <w:szCs w:val="16"/>
+              </w:rPr>
+              <w:t xml:space="preserve">51.8 / 22.9 / 25.3</w:t>
+            </w:r>
+          </w:p>
+        </w:tc>
+        <w:tc>
+          <w:tcPr>
+            <w:tcW w:type="dxa" w:w="1000"/>
+            <w:tcBorders>
+              <w:top w:val="single" w:color="D0D3D6" w:sz="4"/>
+              <w:left w:val="single" w:color="D0D3D6" w:sz="4"/>
+              <w:bottom w:val="single" w:color="D0D3D6" w:sz="4"/>
+              <w:right w:val="single" w:color="D0D3D6" w:sz="4"/>
+            </w:tcBorders>
+            <w:tcMar>
+              <w:top w:type="dxa" w:w="50"/>
+              <w:left w:type="dxa" w:w="80"/>
+              <w:bottom w:type="dxa" w:w="50"/>
+              <w:right w:type="dxa" w:w="80"/>
+            </w:tcMar>
+          </w:tcPr>
+          <w:p>
+            <w:pPr>
+              <w:jc w:val="center"/>
+            </w:pPr>
+            <w:r>
+              <w:rPr>
+                <w:rFonts w:ascii="Open Sans" w:cs="Open Sans" w:eastAsia="Open Sans" w:hAnsi="Open Sans"/>
+                <w:color w:val="333C46"/>
+                <w:sz w:val="16"/>
+                <w:szCs w:val="16"/>
+              </w:rPr>
+              <w:t xml:space="preserve">Home</w:t>
+            </w:r>
+          </w:p>
+        </w:tc>
+        <w:tc>
+          <w:tcPr>
+            <w:tcW w:type="dxa" w:w="1000"/>
+            <w:tcBorders>
+              <w:top w:val="single" w:color="D0D3D6" w:sz="4"/>
+              <w:left w:val="single" w:color="D0D3D6" w:sz="4"/>
+              <w:bottom w:val="single" w:color="D0D3D6" w:sz="4"/>
+              <w:right w:val="single" w:color="D0D3D6" w:sz="4"/>
+            </w:tcBorders>
+            <w:tcMar>
+              <w:top w:type="dxa" w:w="50"/>
+              <w:left w:type="dxa" w:w="80"/>
+              <w:bottom w:type="dxa" w:w="50"/>
+              <w:right w:type="dxa" w:w="80"/>
+            </w:tcMar>
+          </w:tcPr>
+          <w:p>
+            <w:pPr>
+              <w:jc w:val="center"/>
+            </w:pPr>
+            <w:r>
+              <w:rPr>
+                <w:rFonts w:ascii="Open Sans" w:cs="Open Sans" w:eastAsia="Open Sans" w:hAnsi="Open Sans"/>
+                <w:color w:val="333C46"/>
+                <w:sz w:val="16"/>
+                <w:szCs w:val="16"/>
+              </w:rPr>
+              <w:t xml:space="preserve">Home</w:t>
+            </w:r>
+          </w:p>
+        </w:tc>
+        <w:tc>
+          <w:tcPr>
+            <w:tcW w:type="dxa" w:w="1700"/>
+            <w:tcBorders>
+              <w:top w:val="single" w:color="D0D3D6" w:sz="4"/>
+              <w:left w:val="single" w:color="D0D3D6" w:sz="4"/>
+              <w:bottom w:val="single" w:color="D0D3D6" w:sz="4"/>
+              <w:right w:val="single" w:color="D0D3D6" w:sz="4"/>
+            </w:tcBorders>
+            <w:tcMar>
+              <w:top w:type="dxa" w:w="50"/>
+              <w:left w:type="dxa" w:w="80"/>
+              <w:bottom w:type="dxa" w:w="50"/>
+              <w:right w:type="dxa" w:w="80"/>
+            </w:tcMar>
+          </w:tcPr>
+          <w:p>
+            <w:pPr>
+              <w:jc w:val="center"/>
+            </w:pPr>
+            <w:r>
+              <w:rPr>
+                <w:rFonts w:ascii="Open Sans" w:cs="Open Sans" w:eastAsia="Open Sans" w:hAnsi="Open Sans"/>
+                <w:b/>
+                <w:bCs/>
+                <w:color w:val="333C46"/>
+                <w:sz w:val="16"/>
+                <w:szCs w:val="16"/>
+              </w:rPr>
+              <w:t xml:space="preserve">Home 2-1</w:t>
+            </w:r>
+          </w:p>
+        </w:tc>
+        <w:tc>
+          <w:tcPr>
+            <w:tcW w:type="dxa" w:w="1300"/>
+            <w:tcBorders>
+              <w:top w:val="single" w:color="D0D3D6" w:sz="4"/>
+              <w:left w:val="single" w:color="D0D3D6" w:sz="4"/>
+              <w:bottom w:val="single" w:color="D0D3D6" w:sz="4"/>
+              <w:right w:val="single" w:color="D0D3D6" w:sz="4"/>
+            </w:tcBorders>
+            <w:shd w:fill="E3F6EC" w:color="auto" w:val="clear"/>
+            <w:tcMar>
+              <w:top w:type="dxa" w:w="50"/>
+              <w:left w:type="dxa" w:w="80"/>
+              <w:bottom w:type="dxa" w:w="50"/>
+              <w:right w:type="dxa" w:w="80"/>
+            </w:tcMar>
+          </w:tcPr>
+          <w:p>
+            <w:pPr>
+              <w:jc w:val="center"/>
+            </w:pPr>
+            <w:r>
+              <w:rPr>
+                <w:rFonts w:ascii="Open Sans" w:cs="Open Sans" w:eastAsia="Open Sans" w:hAnsi="Open Sans"/>
+                <w:color w:val="333C46"/>
+                <w:sz w:val="16"/>
+                <w:szCs w:val="16"/>
+              </w:rPr>
+              <w:t xml:space="preserve">Yes</w:t>
+            </w:r>
+          </w:p>
+        </w:tc>
+      </w:tr>
+      <w:tr>
+        <w:tc>
+          <w:tcPr>
+            <w:tcW w:type="dxa" w:w="2838"/>
+            <w:tcBorders>
+              <w:top w:val="single" w:color="D0D3D6" w:sz="4"/>
+              <w:left w:val="single" w:color="D0D3D6" w:sz="4"/>
+              <w:bottom w:val="single" w:color="D0D3D6" w:sz="4"/>
+              <w:right w:val="single" w:color="D0D3D6" w:sz="4"/>
+            </w:tcBorders>
+            <w:shd w:fill="F6F8FA" w:color="auto" w:val="clear"/>
+            <w:tcMar>
+              <w:top w:type="dxa" w:w="50"/>
+              <w:left w:type="dxa" w:w="80"/>
+              <w:bottom w:type="dxa" w:w="50"/>
+              <w:right w:type="dxa" w:w="80"/>
+            </w:tcMar>
+          </w:tcPr>
+          <w:p>
+            <w:pPr>
+              <w:jc w:val="left"/>
+            </w:pPr>
+            <w:r>
+              <w:rPr>
+                <w:rFonts w:ascii="Open Sans" w:cs="Open Sans" w:eastAsia="Open Sans" w:hAnsi="Open Sans"/>
+                <w:color w:val="333C46"/>
+                <w:sz w:val="16"/>
+                <w:szCs w:val="16"/>
+              </w:rPr>
+              <w:t xml:space="preserve">Ipswich v Fulham</w:t>
+            </w:r>
+          </w:p>
+        </w:tc>
+        <w:tc>
+          <w:tcPr>
+            <w:tcW w:type="dxa" w:w="1800"/>
+            <w:tcBorders>
+              <w:top w:val="single" w:color="D0D3D6" w:sz="4"/>
+              <w:left w:val="single" w:color="D0D3D6" w:sz="4"/>
+              <w:bottom w:val="single" w:color="D0D3D6" w:sz="4"/>
+              <w:right w:val="single" w:color="D0D3D6" w:sz="4"/>
+            </w:tcBorders>
+            <w:shd w:fill="F6F8FA" w:color="auto" w:val="clear"/>
+            <w:tcMar>
+              <w:top w:type="dxa" w:w="50"/>
+              <w:left w:type="dxa" w:w="80"/>
+              <w:bottom w:type="dxa" w:w="50"/>
+              <w:right w:type="dxa" w:w="80"/>
+            </w:tcMar>
+          </w:tcPr>
+          <w:p>
+            <w:pPr>
+              <w:jc w:val="center"/>
+            </w:pPr>
+            <w:r>
+              <w:rPr>
+                <w:rFonts w:ascii="Open Sans" w:cs="Open Sans" w:eastAsia="Open Sans" w:hAnsi="Open Sans"/>
+                <w:color w:val="333C46"/>
+                <w:sz w:val="16"/>
+                <w:szCs w:val="16"/>
+              </w:rPr>
+              <w:t xml:space="preserve">44.8 / 26.9 / 28.3</w:t>
+            </w:r>
+          </w:p>
+        </w:tc>
+        <w:tc>
+          <w:tcPr>
+            <w:tcW w:type="dxa" w:w="1000"/>
+            <w:tcBorders>
+              <w:top w:val="single" w:color="D0D3D6" w:sz="4"/>
+              <w:left w:val="single" w:color="D0D3D6" w:sz="4"/>
+              <w:bottom w:val="single" w:color="D0D3D6" w:sz="4"/>
+              <w:right w:val="single" w:color="D0D3D6" w:sz="4"/>
+            </w:tcBorders>
+            <w:shd w:fill="F6F8FA" w:color="auto" w:val="clear"/>
+            <w:tcMar>
+              <w:top w:type="dxa" w:w="50"/>
+              <w:left w:type="dxa" w:w="80"/>
+              <w:bottom w:type="dxa" w:w="50"/>
+              <w:right w:type="dxa" w:w="80"/>
+            </w:tcMar>
+          </w:tcPr>
+          <w:p>
+            <w:pPr>
+              <w:jc w:val="center"/>
+            </w:pPr>
+            <w:r>
+              <w:rPr>
+                <w:rFonts w:ascii="Open Sans" w:cs="Open Sans" w:eastAsia="Open Sans" w:hAnsi="Open Sans"/>
+                <w:color w:val="333C46"/>
+                <w:sz w:val="16"/>
+                <w:szCs w:val="16"/>
+              </w:rPr>
+              <w:t xml:space="preserve">Home</w:t>
+            </w:r>
+          </w:p>
+        </w:tc>
+        <w:tc>
+          <w:tcPr>
+            <w:tcW w:type="dxa" w:w="1000"/>
+            <w:tcBorders>
+              <w:top w:val="single" w:color="D0D3D6" w:sz="4"/>
+              <w:left w:val="single" w:color="D0D3D6" w:sz="4"/>
+              <w:bottom w:val="single" w:color="D0D3D6" w:sz="4"/>
+              <w:right w:val="single" w:color="D0D3D6" w:sz="4"/>
+            </w:tcBorders>
+            <w:shd w:fill="F6F8FA" w:color="auto" w:val="clear"/>
+            <w:tcMar>
+              <w:top w:type="dxa" w:w="50"/>
+              <w:left w:type="dxa" w:w="80"/>
+              <w:bottom w:type="dxa" w:w="50"/>
+              <w:right w:type="dxa" w:w="80"/>
+            </w:tcMar>
+          </w:tcPr>
+          <w:p>
+            <w:pPr>
+              <w:jc w:val="center"/>
+            </w:pPr>
+            <w:r>
+              <w:rPr>
+                <w:rFonts w:ascii="Open Sans" w:cs="Open Sans" w:eastAsia="Open Sans" w:hAnsi="Open Sans"/>
+                <w:color w:val="333C46"/>
+                <w:sz w:val="16"/>
+                <w:szCs w:val="16"/>
+              </w:rPr>
+              <w:t xml:space="preserve">Home</w:t>
+            </w:r>
+          </w:p>
+        </w:tc>
+        <w:tc>
+          <w:tcPr>
+            <w:tcW w:type="dxa" w:w="1700"/>
+            <w:tcBorders>
+              <w:top w:val="single" w:color="D0D3D6" w:sz="4"/>
+              <w:left w:val="single" w:color="D0D3D6" w:sz="4"/>
+              <w:bottom w:val="single" w:color="D0D3D6" w:sz="4"/>
+              <w:right w:val="single" w:color="D0D3D6" w:sz="4"/>
+            </w:tcBorders>
+            <w:shd w:fill="F6F8FA" w:color="auto" w:val="clear"/>
+            <w:tcMar>
+              <w:top w:type="dxa" w:w="50"/>
+              <w:left w:type="dxa" w:w="80"/>
+              <w:bottom w:type="dxa" w:w="50"/>
+              <w:right w:type="dxa" w:w="80"/>
+            </w:tcMar>
+          </w:tcPr>
+          <w:p>
+            <w:pPr>
+              <w:jc w:val="center"/>
+            </w:pPr>
+            <w:r>
+              <w:rPr>
+                <w:rFonts w:ascii="Open Sans" w:cs="Open Sans" w:eastAsia="Open Sans" w:hAnsi="Open Sans"/>
+                <w:b/>
+                <w:bCs/>
+                <w:color w:val="333C46"/>
+                <w:sz w:val="16"/>
+                <w:szCs w:val="16"/>
+              </w:rPr>
+              <w:t xml:space="preserve">Draw 1-1</w:t>
+            </w:r>
+          </w:p>
+        </w:tc>
+        <w:tc>
+          <w:tcPr>
+            <w:tcW w:type="dxa" w:w="1300"/>
+            <w:tcBorders>
+              <w:top w:val="single" w:color="D0D3D6" w:sz="4"/>
+              <w:left w:val="single" w:color="D0D3D6" w:sz="4"/>
+              <w:bottom w:val="single" w:color="D0D3D6" w:sz="4"/>
+              <w:right w:val="single" w:color="D0D3D6" w:sz="4"/>
+            </w:tcBorders>
+            <w:shd w:fill="FBE4E1" w:color="auto" w:val="clear"/>
+            <w:tcMar>
+              <w:top w:type="dxa" w:w="50"/>
+              <w:left w:type="dxa" w:w="80"/>
+              <w:bottom w:type="dxa" w:w="50"/>
+              <w:right w:type="dxa" w:w="80"/>
+            </w:tcMar>
+          </w:tcPr>
+          <w:p>
+            <w:pPr>
+              <w:jc w:val="center"/>
+            </w:pPr>
+            <w:r>
+              <w:rPr>
+                <w:rFonts w:ascii="Open Sans" w:cs="Open Sans" w:eastAsia="Open Sans" w:hAnsi="Open Sans"/>
+                <w:color w:val="333C46"/>
+                <w:sz w:val="16"/>
+                <w:szCs w:val="16"/>
+              </w:rPr>
+              <w:t xml:space="preserve">No</w:t>
+            </w:r>
+          </w:p>
+        </w:tc>
+      </w:tr>
+      <w:tr>
+        <w:tc>
+          <w:tcPr>
+            <w:tcW w:type="dxa" w:w="2838"/>
+            <w:tcBorders>
+              <w:top w:val="single" w:color="D0D3D6" w:sz="4"/>
+              <w:left w:val="single" w:color="D0D3D6" w:sz="4"/>
+              <w:bottom w:val="single" w:color="D0D3D6" w:sz="4"/>
+              <w:right w:val="single" w:color="D0D3D6" w:sz="4"/>
+            </w:tcBorders>
+            <w:tcMar>
+              <w:top w:type="dxa" w:w="50"/>
+              <w:left w:type="dxa" w:w="80"/>
+              <w:bottom w:type="dxa" w:w="50"/>
+              <w:right w:type="dxa" w:w="80"/>
+            </w:tcMar>
+          </w:tcPr>
+          <w:p>
+            <w:pPr>
+              <w:jc w:val="left"/>
+            </w:pPr>
+            <w:r>
+              <w:rPr>
+                <w:rFonts w:ascii="Open Sans" w:cs="Open Sans" w:eastAsia="Open Sans" w:hAnsi="Open Sans"/>
+                <w:color w:val="333C46"/>
+                <w:sz w:val="16"/>
+                <w:szCs w:val="16"/>
+              </w:rPr>
+              <w:t xml:space="preserve">Aston Villa v Brentford</w:t>
+            </w:r>
+          </w:p>
+        </w:tc>
+        <w:tc>
+          <w:tcPr>
+            <w:tcW w:type="dxa" w:w="1800"/>
+            <w:tcBorders>
+              <w:top w:val="single" w:color="D0D3D6" w:sz="4"/>
+              <w:left w:val="single" w:color="D0D3D6" w:sz="4"/>
+              <w:bottom w:val="single" w:color="D0D3D6" w:sz="4"/>
+              <w:right w:val="single" w:color="D0D3D6" w:sz="4"/>
+            </w:tcBorders>
+            <w:tcMar>
+              <w:top w:type="dxa" w:w="50"/>
+              <w:left w:type="dxa" w:w="80"/>
+              <w:bottom w:type="dxa" w:w="50"/>
+              <w:right w:type="dxa" w:w="80"/>
+            </w:tcMar>
+          </w:tcPr>
+          <w:p>
+            <w:pPr>
+              <w:jc w:val="center"/>
+            </w:pPr>
+            <w:r>
+              <w:rPr>
+                <w:rFonts w:ascii="Open Sans" w:cs="Open Sans" w:eastAsia="Open Sans" w:hAnsi="Open Sans"/>
+                <w:color w:val="333C46"/>
+                <w:sz w:val="16"/>
+                <w:szCs w:val="16"/>
+              </w:rPr>
+              <w:t xml:space="preserve">47.8 / 26.0 / 26.2</w:t>
+            </w:r>
+          </w:p>
+        </w:tc>
+        <w:tc>
+          <w:tcPr>
+            <w:tcW w:type="dxa" w:w="1000"/>
+            <w:tcBorders>
+              <w:top w:val="single" w:color="D0D3D6" w:sz="4"/>
+              <w:left w:val="single" w:color="D0D3D6" w:sz="4"/>
+              <w:bottom w:val="single" w:color="D0D3D6" w:sz="4"/>
+              <w:right w:val="single" w:color="D0D3D6" w:sz="4"/>
+            </w:tcBorders>
+            <w:tcMar>
+              <w:top w:type="dxa" w:w="50"/>
+              <w:left w:type="dxa" w:w="80"/>
+              <w:bottom w:type="dxa" w:w="50"/>
+              <w:right w:type="dxa" w:w="80"/>
+            </w:tcMar>
+          </w:tcPr>
+          <w:p>
+            <w:pPr>
+              <w:jc w:val="center"/>
+            </w:pPr>
+            <w:r>
+              <w:rPr>
+                <w:rFonts w:ascii="Open Sans" w:cs="Open Sans" w:eastAsia="Open Sans" w:hAnsi="Open Sans"/>
+                <w:color w:val="333C46"/>
+                <w:sz w:val="16"/>
+                <w:szCs w:val="16"/>
+              </w:rPr>
+              <w:t xml:space="preserve">Home</w:t>
+            </w:r>
+          </w:p>
+        </w:tc>
+        <w:tc>
+          <w:tcPr>
+            <w:tcW w:type="dxa" w:w="1000"/>
+            <w:tcBorders>
+              <w:top w:val="single" w:color="D0D3D6" w:sz="4"/>
+              <w:left w:val="single" w:color="D0D3D6" w:sz="4"/>
+              <w:bottom w:val="single" w:color="D0D3D6" w:sz="4"/>
+              <w:right w:val="single" w:color="D0D3D6" w:sz="4"/>
+            </w:tcBorders>
+            <w:tcMar>
+              <w:top w:type="dxa" w:w="50"/>
+              <w:left w:type="dxa" w:w="80"/>
+              <w:bottom w:type="dxa" w:w="50"/>
+              <w:right w:type="dxa" w:w="80"/>
+            </w:tcMar>
+          </w:tcPr>
+          <w:p>
+            <w:pPr>
+              <w:jc w:val="center"/>
+            </w:pPr>
+            <w:r>
+              <w:rPr>
+                <w:rFonts w:ascii="Open Sans" w:cs="Open Sans" w:eastAsia="Open Sans" w:hAnsi="Open Sans"/>
+                <w:color w:val="333C46"/>
+                <w:sz w:val="16"/>
+                <w:szCs w:val="16"/>
+              </w:rPr>
+              <w:t xml:space="preserve">Home</w:t>
+            </w:r>
+          </w:p>
+        </w:tc>
+        <w:tc>
+          <w:tcPr>
+            <w:tcW w:type="dxa" w:w="1700"/>
+            <w:tcBorders>
+              <w:top w:val="single" w:color="D0D3D6" w:sz="4"/>
+              <w:left w:val="single" w:color="D0D3D6" w:sz="4"/>
+              <w:bottom w:val="single" w:color="D0D3D6" w:sz="4"/>
+              <w:right w:val="single" w:color="D0D3D6" w:sz="4"/>
+            </w:tcBorders>
+            <w:tcMar>
+              <w:top w:type="dxa" w:w="50"/>
+              <w:left w:type="dxa" w:w="80"/>
+              <w:bottom w:type="dxa" w:w="50"/>
+              <w:right w:type="dxa" w:w="80"/>
+            </w:tcMar>
+          </w:tcPr>
+          <w:p>
+            <w:pPr>
+              <w:jc w:val="center"/>
+            </w:pPr>
+            <w:r>
+              <w:rPr>
+                <w:rFonts w:ascii="Open Sans" w:cs="Open Sans" w:eastAsia="Open Sans" w:hAnsi="Open Sans"/>
+                <w:b/>
+                <w:bCs/>
+                <w:color w:val="333C46"/>
+                <w:sz w:val="16"/>
+                <w:szCs w:val="16"/>
+              </w:rPr>
+              <w:t xml:space="preserve">Draw 1-1</w:t>
+            </w:r>
+          </w:p>
+        </w:tc>
+        <w:tc>
+          <w:tcPr>
+            <w:tcW w:type="dxa" w:w="1300"/>
+            <w:tcBorders>
+              <w:top w:val="single" w:color="D0D3D6" w:sz="4"/>
+              <w:left w:val="single" w:color="D0D3D6" w:sz="4"/>
+              <w:bottom w:val="single" w:color="D0D3D6" w:sz="4"/>
+              <w:right w:val="single" w:color="D0D3D6" w:sz="4"/>
+            </w:tcBorders>
+            <w:shd w:fill="FBE4E1" w:color="auto" w:val="clear"/>
+            <w:tcMar>
+              <w:top w:type="dxa" w:w="50"/>
+              <w:left w:type="dxa" w:w="80"/>
+              <w:bottom w:type="dxa" w:w="50"/>
+              <w:right w:type="dxa" w:w="80"/>
+            </w:tcMar>
+          </w:tcPr>
+          <w:p>
+            <w:pPr>
+              <w:jc w:val="center"/>
+            </w:pPr>
+            <w:r>
+              <w:rPr>
+                <w:rFonts w:ascii="Open Sans" w:cs="Open Sans" w:eastAsia="Open Sans" w:hAnsi="Open Sans"/>
+                <w:color w:val="333C46"/>
+                <w:sz w:val="16"/>
+                <w:szCs w:val="16"/>
+              </w:rPr>
+              <w:t xml:space="preserve">No</w:t>
+            </w:r>
+          </w:p>
+        </w:tc>
+      </w:tr>
+      <w:tr>
+        <w:tc>
+          <w:tcPr>
+            <w:tcW w:type="dxa" w:w="2838"/>
+            <w:tcBorders>
+              <w:top w:val="single" w:color="D0D3D6" w:sz="4"/>
+              <w:left w:val="single" w:color="D0D3D6" w:sz="4"/>
+              <w:bottom w:val="single" w:color="D0D3D6" w:sz="4"/>
+              <w:right w:val="single" w:color="D0D3D6" w:sz="4"/>
+            </w:tcBorders>
+            <w:shd w:fill="F6F8FA" w:color="auto" w:val="clear"/>
+            <w:tcMar>
+              <w:top w:type="dxa" w:w="50"/>
+              <w:left w:type="dxa" w:w="80"/>
+              <w:bottom w:type="dxa" w:w="50"/>
+              <w:right w:type="dxa" w:w="80"/>
+            </w:tcMar>
+          </w:tcPr>
+          <w:p>
+            <w:pPr>
+              <w:jc w:val="left"/>
+            </w:pPr>
+            <w:r>
+              <w:rPr>
+                <w:rFonts w:ascii="Open Sans" w:cs="Open Sans" w:eastAsia="Open Sans" w:hAnsi="Open Sans"/>
+                <w:color w:val="333C46"/>
+                <w:sz w:val="16"/>
+                <w:szCs w:val="16"/>
+              </w:rPr>
+              <w:t xml:space="preserve">Man Utd v Tottenham</w:t>
+            </w:r>
+          </w:p>
+        </w:tc>
+        <w:tc>
+          <w:tcPr>
+            <w:tcW w:type="dxa" w:w="1800"/>
+            <w:tcBorders>
+              <w:top w:val="single" w:color="D0D3D6" w:sz="4"/>
+              <w:left w:val="single" w:color="D0D3D6" w:sz="4"/>
+              <w:bottom w:val="single" w:color="D0D3D6" w:sz="4"/>
+              <w:right w:val="single" w:color="D0D3D6" w:sz="4"/>
+            </w:tcBorders>
+            <w:shd w:fill="F6F8FA" w:color="auto" w:val="clear"/>
+            <w:tcMar>
+              <w:top w:type="dxa" w:w="50"/>
+              <w:left w:type="dxa" w:w="80"/>
+              <w:bottom w:type="dxa" w:w="50"/>
+              <w:right w:type="dxa" w:w="80"/>
+            </w:tcMar>
+          </w:tcPr>
+          <w:p>
+            <w:pPr>
+              <w:jc w:val="center"/>
+            </w:pPr>
+            <w:r>
+              <w:rPr>
+                <w:rFonts w:ascii="Open Sans" w:cs="Open Sans" w:eastAsia="Open Sans" w:hAnsi="Open Sans"/>
+                <w:color w:val="333C46"/>
+                <w:sz w:val="16"/>
+                <w:szCs w:val="16"/>
+              </w:rPr>
+              <w:t xml:space="preserve">54.1 / 23.6 / 22.3</w:t>
+            </w:r>
+          </w:p>
+        </w:tc>
+        <w:tc>
+          <w:tcPr>
+            <w:tcW w:type="dxa" w:w="1000"/>
+            <w:tcBorders>
+              <w:top w:val="single" w:color="D0D3D6" w:sz="4"/>
+              <w:left w:val="single" w:color="D0D3D6" w:sz="4"/>
+              <w:bottom w:val="single" w:color="D0D3D6" w:sz="4"/>
+              <w:right w:val="single" w:color="D0D3D6" w:sz="4"/>
+            </w:tcBorders>
+            <w:shd w:fill="F6F8FA" w:color="auto" w:val="clear"/>
+            <w:tcMar>
+              <w:top w:type="dxa" w:w="50"/>
+              <w:left w:type="dxa" w:w="80"/>
+              <w:bottom w:type="dxa" w:w="50"/>
+              <w:right w:type="dxa" w:w="80"/>
+            </w:tcMar>
+          </w:tcPr>
+          <w:p>
+            <w:pPr>
+              <w:jc w:val="center"/>
+            </w:pPr>
+            <w:r>
+              <w:rPr>
+                <w:rFonts w:ascii="Open Sans" w:cs="Open Sans" w:eastAsia="Open Sans" w:hAnsi="Open Sans"/>
+                <w:color w:val="333C46"/>
+                <w:sz w:val="16"/>
+                <w:szCs w:val="16"/>
+              </w:rPr>
+              <w:t xml:space="preserve">Home</w:t>
+            </w:r>
+          </w:p>
+        </w:tc>
+        <w:tc>
+          <w:tcPr>
+            <w:tcW w:type="dxa" w:w="1000"/>
+            <w:tcBorders>
+              <w:top w:val="single" w:color="D0D3D6" w:sz="4"/>
+              <w:left w:val="single" w:color="D0D3D6" w:sz="4"/>
+              <w:bottom w:val="single" w:color="D0D3D6" w:sz="4"/>
+              <w:right w:val="single" w:color="D0D3D6" w:sz="4"/>
+            </w:tcBorders>
+            <w:shd w:fill="F6F8FA" w:color="auto" w:val="clear"/>
+            <w:tcMar>
+              <w:top w:type="dxa" w:w="50"/>
+              <w:left w:type="dxa" w:w="80"/>
+              <w:bottom w:type="dxa" w:w="50"/>
+              <w:right w:type="dxa" w:w="80"/>
+            </w:tcMar>
+          </w:tcPr>
+          <w:p>
+            <w:pPr>
+              <w:jc w:val="center"/>
+            </w:pPr>
+            <w:r>
+              <w:rPr>
+                <w:rFonts w:ascii="Open Sans" w:cs="Open Sans" w:eastAsia="Open Sans" w:hAnsi="Open Sans"/>
+                <w:color w:val="333C46"/>
+                <w:sz w:val="16"/>
+                <w:szCs w:val="16"/>
+              </w:rPr>
+              <w:t xml:space="preserve">Home</w:t>
+            </w:r>
+          </w:p>
+        </w:tc>
+        <w:tc>
+          <w:tcPr>
+            <w:tcW w:type="dxa" w:w="1700"/>
+            <w:tcBorders>
+              <w:top w:val="single" w:color="D0D3D6" w:sz="4"/>
+              <w:left w:val="single" w:color="D0D3D6" w:sz="4"/>
+              <w:bottom w:val="single" w:color="D0D3D6" w:sz="4"/>
+              <w:right w:val="single" w:color="D0D3D6" w:sz="4"/>
+            </w:tcBorders>
+            <w:shd w:fill="F6F8FA" w:color="auto" w:val="clear"/>
+            <w:tcMar>
+              <w:top w:type="dxa" w:w="50"/>
+              <w:left w:type="dxa" w:w="80"/>
+              <w:bottom w:type="dxa" w:w="50"/>
+              <w:right w:type="dxa" w:w="80"/>
+            </w:tcMar>
+          </w:tcPr>
+          <w:p>
+            <w:pPr>
+              <w:jc w:val="center"/>
+            </w:pPr>
+            <w:r>
+              <w:rPr>
+                <w:rFonts w:ascii="Open Sans" w:cs="Open Sans" w:eastAsia="Open Sans" w:hAnsi="Open Sans"/>
+                <w:b/>
+                <w:bCs/>
+                <w:color w:val="333C46"/>
+                <w:sz w:val="16"/>
+                <w:szCs w:val="16"/>
+              </w:rPr>
+              <w:t xml:space="preserve">Home 2-1</w:t>
+            </w:r>
+          </w:p>
+        </w:tc>
+        <w:tc>
+          <w:tcPr>
+            <w:tcW w:type="dxa" w:w="1300"/>
+            <w:tcBorders>
+              <w:top w:val="single" w:color="D0D3D6" w:sz="4"/>
+              <w:left w:val="single" w:color="D0D3D6" w:sz="4"/>
+              <w:bottom w:val="single" w:color="D0D3D6" w:sz="4"/>
+              <w:right w:val="single" w:color="D0D3D6" w:sz="4"/>
+            </w:tcBorders>
+            <w:shd w:fill="E3F6EC" w:color="auto" w:val="clear"/>
+            <w:tcMar>
+              <w:top w:type="dxa" w:w="50"/>
+              <w:left w:type="dxa" w:w="80"/>
+              <w:bottom w:type="dxa" w:w="50"/>
+              <w:right w:type="dxa" w:w="80"/>
+            </w:tcMar>
+          </w:tcPr>
+          <w:p>
+            <w:pPr>
+              <w:jc w:val="center"/>
+            </w:pPr>
+            <w:r>
+              <w:rPr>
+                <w:rFonts w:ascii="Open Sans" w:cs="Open Sans" w:eastAsia="Open Sans" w:hAnsi="Open Sans"/>
+                <w:color w:val="333C46"/>
+                <w:sz w:val="16"/>
+                <w:szCs w:val="16"/>
+              </w:rPr>
+              <w:t xml:space="preserve">Yes</w:t>
+            </w:r>
+          </w:p>
+        </w:tc>
+      </w:tr>
+      <w:tr>
+        <w:tc>
+          <w:tcPr>
+            <w:tcW w:type="dxa" w:w="2838"/>
+            <w:tcBorders>
+              <w:top w:val="single" w:color="D0D3D6" w:sz="4"/>
+              <w:left w:val="single" w:color="D0D3D6" w:sz="4"/>
+              <w:bottom w:val="single" w:color="D0D3D6" w:sz="4"/>
+              <w:right w:val="single" w:color="D0D3D6" w:sz="4"/>
+            </w:tcBorders>
+            <w:tcMar>
+              <w:top w:type="dxa" w:w="50"/>
+              <w:left w:type="dxa" w:w="80"/>
+              <w:bottom w:type="dxa" w:w="50"/>
+              <w:right w:type="dxa" w:w="80"/>
+            </w:tcMar>
+          </w:tcPr>
+          <w:p>
+            <w:pPr>
+              <w:jc w:val="left"/>
+            </w:pPr>
+            <w:r>
+              <w:rPr>
+                <w:rFonts w:ascii="Open Sans" w:cs="Open Sans" w:eastAsia="Open Sans" w:hAnsi="Open Sans"/>
+                <w:color w:val="333C46"/>
+                <w:sz w:val="16"/>
+                <w:szCs w:val="16"/>
+              </w:rPr>
+              <w:t xml:space="preserve">Hull v Everton</w:t>
+            </w:r>
+          </w:p>
+        </w:tc>
+        <w:tc>
+          <w:tcPr>
+            <w:tcW w:type="dxa" w:w="1800"/>
+            <w:tcBorders>
+              <w:top w:val="single" w:color="D0D3D6" w:sz="4"/>
+              <w:left w:val="single" w:color="D0D3D6" w:sz="4"/>
+              <w:bottom w:val="single" w:color="D0D3D6" w:sz="4"/>
+              <w:right w:val="single" w:color="D0D3D6" w:sz="4"/>
+            </w:tcBorders>
+            <w:tcMar>
+              <w:top w:type="dxa" w:w="50"/>
+              <w:left w:type="dxa" w:w="80"/>
+              <w:bottom w:type="dxa" w:w="50"/>
+              <w:right w:type="dxa" w:w="80"/>
+            </w:tcMar>
+          </w:tcPr>
+          <w:p>
+            <w:pPr>
+              <w:jc w:val="center"/>
+            </w:pPr>
+            <w:r>
+              <w:rPr>
+                <w:rFonts w:ascii="Open Sans" w:cs="Open Sans" w:eastAsia="Open Sans" w:hAnsi="Open Sans"/>
+                <w:color w:val="333C46"/>
+                <w:sz w:val="16"/>
+                <w:szCs w:val="16"/>
+              </w:rPr>
+              <w:t xml:space="preserve">28.4 / 25.9 / 45.7</w:t>
+            </w:r>
+          </w:p>
+        </w:tc>
+        <w:tc>
+          <w:tcPr>
+            <w:tcW w:type="dxa" w:w="1000"/>
+            <w:tcBorders>
+              <w:top w:val="single" w:color="D0D3D6" w:sz="4"/>
+              <w:left w:val="single" w:color="D0D3D6" w:sz="4"/>
+              <w:bottom w:val="single" w:color="D0D3D6" w:sz="4"/>
+              <w:right w:val="single" w:color="D0D3D6" w:sz="4"/>
+            </w:tcBorders>
+            <w:tcMar>
+              <w:top w:type="dxa" w:w="50"/>
+              <w:left w:type="dxa" w:w="80"/>
+              <w:bottom w:type="dxa" w:w="50"/>
+              <w:right w:type="dxa" w:w="80"/>
+            </w:tcMar>
+          </w:tcPr>
+          <w:p>
+            <w:pPr>
+              <w:jc w:val="center"/>
+            </w:pPr>
+            <w:r>
+              <w:rPr>
+                <w:rFonts w:ascii="Open Sans" w:cs="Open Sans" w:eastAsia="Open Sans" w:hAnsi="Open Sans"/>
+                <w:color w:val="333C46"/>
+                <w:sz w:val="16"/>
+                <w:szCs w:val="16"/>
+              </w:rPr>
+              <w:t xml:space="preserve">Away</w:t>
+            </w:r>
+          </w:p>
+        </w:tc>
+        <w:tc>
+          <w:tcPr>
+            <w:tcW w:type="dxa" w:w="1000"/>
+            <w:tcBorders>
+              <w:top w:val="single" w:color="D0D3D6" w:sz="4"/>
+              <w:left w:val="single" w:color="D0D3D6" w:sz="4"/>
+              <w:bottom w:val="single" w:color="D0D3D6" w:sz="4"/>
+              <w:right w:val="single" w:color="D0D3D6" w:sz="4"/>
+            </w:tcBorders>
+            <w:tcMar>
+              <w:top w:type="dxa" w:w="50"/>
+              <w:left w:type="dxa" w:w="80"/>
+              <w:bottom w:type="dxa" w:w="50"/>
+              <w:right w:type="dxa" w:w="80"/>
+            </w:tcMar>
+          </w:tcPr>
+          <w:p>
+            <w:pPr>
+              <w:jc w:val="center"/>
+            </w:pPr>
+            <w:r>
+              <w:rPr>
+                <w:rFonts w:ascii="Open Sans" w:cs="Open Sans" w:eastAsia="Open Sans" w:hAnsi="Open Sans"/>
+                <w:color w:val="333C46"/>
+                <w:sz w:val="16"/>
+                <w:szCs w:val="16"/>
+              </w:rPr>
+              <w:t xml:space="preserve">Away</w:t>
+            </w:r>
+          </w:p>
+        </w:tc>
+        <w:tc>
+          <w:tcPr>
+            <w:tcW w:type="dxa" w:w="1700"/>
+            <w:tcBorders>
+              <w:top w:val="single" w:color="D0D3D6" w:sz="4"/>
+              <w:left w:val="single" w:color="D0D3D6" w:sz="4"/>
+              <w:bottom w:val="single" w:color="D0D3D6" w:sz="4"/>
+              <w:right w:val="single" w:color="D0D3D6" w:sz="4"/>
+            </w:tcBorders>
+            <w:tcMar>
+              <w:top w:type="dxa" w:w="50"/>
+              <w:left w:type="dxa" w:w="80"/>
+              <w:bottom w:type="dxa" w:w="50"/>
+              <w:right w:type="dxa" w:w="80"/>
+            </w:tcMar>
+          </w:tcPr>
+          <w:p>
+            <w:pPr>
+              <w:jc w:val="center"/>
+            </w:pPr>
+            <w:r>
+              <w:rPr>
+                <w:rFonts w:ascii="Open Sans" w:cs="Open Sans" w:eastAsia="Open Sans" w:hAnsi="Open Sans"/>
+                <w:b/>
+                <w:bCs/>
+                <w:color w:val="333C46"/>
+                <w:sz w:val="16"/>
+                <w:szCs w:val="16"/>
+              </w:rPr>
+              <w:t xml:space="preserve">Away 0-1</w:t>
+            </w:r>
+          </w:p>
+        </w:tc>
+        <w:tc>
+          <w:tcPr>
+            <w:tcW w:type="dxa" w:w="1300"/>
+            <w:tcBorders>
+              <w:top w:val="single" w:color="D0D3D6" w:sz="4"/>
+              <w:left w:val="single" w:color="D0D3D6" w:sz="4"/>
+              <w:bottom w:val="single" w:color="D0D3D6" w:sz="4"/>
+              <w:right w:val="single" w:color="D0D3D6" w:sz="4"/>
+            </w:tcBorders>
+            <w:shd w:fill="E3F6EC" w:color="auto" w:val="clear"/>
+            <w:tcMar>
+              <w:top w:type="dxa" w:w="50"/>
+              <w:left w:type="dxa" w:w="80"/>
+              <w:bottom w:type="dxa" w:w="50"/>
+              <w:right w:type="dxa" w:w="80"/>
+            </w:tcMar>
+          </w:tcPr>
+          <w:p>
+            <w:pPr>
+              <w:jc w:val="center"/>
+            </w:pPr>
+            <w:r>
+              <w:rPr>
+                <w:rFonts w:ascii="Open Sans" w:cs="Open Sans" w:eastAsia="Open Sans" w:hAnsi="Open Sans"/>
+                <w:color w:val="333C46"/>
+                <w:sz w:val="16"/>
+                <w:szCs w:val="16"/>
+              </w:rPr>
+              <w:t xml:space="preserve">Yes</w:t>
+            </w:r>
+          </w:p>
+        </w:tc>
+      </w:tr>
+      <w:tr>
+        <w:tc>
+          <w:tcPr>
+            <w:tcW w:type="dxa" w:w="2838"/>
+            <w:tcBorders>
+              <w:top w:val="single" w:color="D0D3D6" w:sz="4"/>
+              <w:left w:val="single" w:color="D0D3D6" w:sz="4"/>
+              <w:bottom w:val="single" w:color="D0D3D6" w:sz="4"/>
+              <w:right w:val="single" w:color="D0D3D6" w:sz="4"/>
+            </w:tcBorders>
+            <w:shd w:fill="F6F8FA" w:color="auto" w:val="clear"/>
+            <w:tcMar>
+              <w:top w:type="dxa" w:w="50"/>
+              <w:left w:type="dxa" w:w="80"/>
+              <w:bottom w:type="dxa" w:w="50"/>
+              <w:right w:type="dxa" w:w="80"/>
+            </w:tcMar>
+          </w:tcPr>
+          <w:p>
+            <w:pPr>
+              <w:jc w:val="left"/>
+            </w:pPr>
+            <w:r>
+              <w:rPr>
+                <w:rFonts w:ascii="Open Sans" w:cs="Open Sans" w:eastAsia="Open Sans" w:hAnsi="Open Sans"/>
+                <w:color w:val="333C46"/>
+                <w:sz w:val="16"/>
+                <w:szCs w:val="16"/>
+              </w:rPr>
+              <w:t xml:space="preserve">Crystal Palace v Nott'm Forest</w:t>
+            </w:r>
+          </w:p>
+        </w:tc>
+        <w:tc>
+          <w:tcPr>
+            <w:tcW w:type="dxa" w:w="1800"/>
+            <w:tcBorders>
+              <w:top w:val="single" w:color="D0D3D6" w:sz="4"/>
+              <w:left w:val="single" w:color="D0D3D6" w:sz="4"/>
+              <w:bottom w:val="single" w:color="D0D3D6" w:sz="4"/>
+              <w:right w:val="single" w:color="D0D3D6" w:sz="4"/>
+            </w:tcBorders>
+            <w:shd w:fill="F6F8FA" w:color="auto" w:val="clear"/>
+            <w:tcMar>
+              <w:top w:type="dxa" w:w="50"/>
+              <w:left w:type="dxa" w:w="80"/>
+              <w:bottom w:type="dxa" w:w="50"/>
+              <w:right w:type="dxa" w:w="80"/>
+            </w:tcMar>
+          </w:tcPr>
+          <w:p>
+            <w:pPr>
+              <w:jc w:val="center"/>
+            </w:pPr>
+            <w:r>
+              <w:rPr>
+                <w:rFonts w:ascii="Open Sans" w:cs="Open Sans" w:eastAsia="Open Sans" w:hAnsi="Open Sans"/>
+                <w:color w:val="333C46"/>
+                <w:sz w:val="16"/>
+                <w:szCs w:val="16"/>
+              </w:rPr>
+              <w:t xml:space="preserve">36.3 / 28.8 / 34.9</w:t>
+            </w:r>
+          </w:p>
+        </w:tc>
+        <w:tc>
+          <w:tcPr>
+            <w:tcW w:type="dxa" w:w="1000"/>
+            <w:tcBorders>
+              <w:top w:val="single" w:color="D0D3D6" w:sz="4"/>
+              <w:left w:val="single" w:color="D0D3D6" w:sz="4"/>
+              <w:bottom w:val="single" w:color="D0D3D6" w:sz="4"/>
+              <w:right w:val="single" w:color="D0D3D6" w:sz="4"/>
+            </w:tcBorders>
+            <w:shd w:fill="F6F8FA" w:color="auto" w:val="clear"/>
+            <w:tcMar>
+              <w:top w:type="dxa" w:w="50"/>
+              <w:left w:type="dxa" w:w="80"/>
+              <w:bottom w:type="dxa" w:w="50"/>
+              <w:right w:type="dxa" w:w="80"/>
+            </w:tcMar>
+          </w:tcPr>
+          <w:p>
+            <w:pPr>
+              <w:jc w:val="center"/>
+            </w:pPr>
+            <w:r>
+              <w:rPr>
+                <w:rFonts w:ascii="Open Sans" w:cs="Open Sans" w:eastAsia="Open Sans" w:hAnsi="Open Sans"/>
+                <w:color w:val="333C46"/>
+                <w:sz w:val="16"/>
+                <w:szCs w:val="16"/>
+              </w:rPr>
+              <w:t xml:space="preserve">Home</w:t>
+            </w:r>
+          </w:p>
+        </w:tc>
+        <w:tc>
+          <w:tcPr>
+            <w:tcW w:type="dxa" w:w="1000"/>
+            <w:tcBorders>
+              <w:top w:val="single" w:color="D0D3D6" w:sz="4"/>
+              <w:left w:val="single" w:color="D0D3D6" w:sz="4"/>
+              <w:bottom w:val="single" w:color="D0D3D6" w:sz="4"/>
+              <w:right w:val="single" w:color="D0D3D6" w:sz="4"/>
+            </w:tcBorders>
+            <w:shd w:fill="F6F8FA" w:color="auto" w:val="clear"/>
+            <w:tcMar>
+              <w:top w:type="dxa" w:w="50"/>
+              <w:left w:type="dxa" w:w="80"/>
+              <w:bottom w:type="dxa" w:w="50"/>
+              <w:right w:type="dxa" w:w="80"/>
+            </w:tcMar>
+          </w:tcPr>
+          <w:p>
+            <w:pPr>
+              <w:jc w:val="center"/>
+            </w:pPr>
+            <w:r>
+              <w:rPr>
+                <w:rFonts w:ascii="Open Sans" w:cs="Open Sans" w:eastAsia="Open Sans" w:hAnsi="Open Sans"/>
+                <w:color w:val="333C46"/>
+                <w:sz w:val="16"/>
+                <w:szCs w:val="16"/>
+              </w:rPr>
+              <w:t xml:space="preserve">Draw</w:t>
+            </w:r>
+          </w:p>
+        </w:tc>
+        <w:tc>
+          <w:tcPr>
+            <w:tcW w:type="dxa" w:w="1700"/>
+            <w:tcBorders>
+              <w:top w:val="single" w:color="D0D3D6" w:sz="4"/>
+              <w:left w:val="single" w:color="D0D3D6" w:sz="4"/>
+              <w:bottom w:val="single" w:color="D0D3D6" w:sz="4"/>
+              <w:right w:val="single" w:color="D0D3D6" w:sz="4"/>
+            </w:tcBorders>
+            <w:shd w:fill="F6F8FA" w:color="auto" w:val="clear"/>
+            <w:tcMar>
+              <w:top w:type="dxa" w:w="50"/>
+              <w:left w:type="dxa" w:w="80"/>
+              <w:bottom w:type="dxa" w:w="50"/>
+              <w:right w:type="dxa" w:w="80"/>
+            </w:tcMar>
+          </w:tcPr>
+          <w:p>
+            <w:pPr>
+              <w:jc w:val="center"/>
+            </w:pPr>
+            <w:r>
+              <w:rPr>
+                <w:rFonts w:ascii="Open Sans" w:cs="Open Sans" w:eastAsia="Open Sans" w:hAnsi="Open Sans"/>
+                <w:b/>
+                <w:bCs/>
+                <w:color w:val="333C46"/>
+                <w:sz w:val="16"/>
+                <w:szCs w:val="16"/>
+              </w:rPr>
+              <w:t xml:space="preserve">Draw 1-1</w:t>
+            </w:r>
+          </w:p>
+        </w:tc>
+        <w:tc>
+          <w:tcPr>
+            <w:tcW w:type="dxa" w:w="1300"/>
+            <w:tcBorders>
+              <w:top w:val="single" w:color="D0D3D6" w:sz="4"/>
+              <w:left w:val="single" w:color="D0D3D6" w:sz="4"/>
+              <w:bottom w:val="single" w:color="D0D3D6" w:sz="4"/>
+              <w:right w:val="single" w:color="D0D3D6" w:sz="4"/>
+            </w:tcBorders>
+            <w:shd w:fill="E3F6EC" w:color="auto" w:val="clear"/>
+            <w:tcMar>
+              <w:top w:type="dxa" w:w="50"/>
+              <w:left w:type="dxa" w:w="80"/>
+              <w:bottom w:type="dxa" w:w="50"/>
+              <w:right w:type="dxa" w:w="80"/>
+            </w:tcMar>
+          </w:tcPr>
+          <w:p>
+            <w:pPr>
+              <w:jc w:val="center"/>
+            </w:pPr>
+            <w:r>
+              <w:rPr>
+                <w:rFonts w:ascii="Open Sans" w:cs="Open Sans" w:eastAsia="Open Sans" w:hAnsi="Open Sans"/>
+                <w:color w:val="333C46"/>
+                <w:sz w:val="16"/>
+                <w:szCs w:val="16"/>
+              </w:rPr>
+              <w:t xml:space="preserve">Yes</w:t>
+            </w:r>
+          </w:p>
+        </w:tc>
+      </w:tr>
+      <w:tr>
+        <w:tc>
+          <w:tcPr>
+            <w:tcW w:type="dxa" w:w="2838"/>
+            <w:tcBorders>
+              <w:top w:val="single" w:color="D0D3D6" w:sz="4"/>
+              <w:left w:val="single" w:color="D0D3D6" w:sz="4"/>
+              <w:bottom w:val="single" w:color="D0D3D6" w:sz="4"/>
+              <w:right w:val="single" w:color="D0D3D6" w:sz="4"/>
+            </w:tcBorders>
+            <w:tcMar>
+              <w:top w:type="dxa" w:w="50"/>
+              <w:left w:type="dxa" w:w="80"/>
+              <w:bottom w:type="dxa" w:w="50"/>
+              <w:right w:type="dxa" w:w="80"/>
+            </w:tcMar>
+          </w:tcPr>
+          <w:p>
+            <w:pPr>
+              <w:jc w:val="left"/>
+            </w:pPr>
+            <w:r>
+              <w:rPr>
+                <w:rFonts w:ascii="Open Sans" w:cs="Open Sans" w:eastAsia="Open Sans" w:hAnsi="Open Sans"/>
+                <w:color w:val="333C46"/>
+                <w:sz w:val="16"/>
+                <w:szCs w:val="16"/>
+              </w:rPr>
+              <w:t xml:space="preserve">Liverpool v Man City</w:t>
+            </w:r>
+          </w:p>
+        </w:tc>
+        <w:tc>
+          <w:tcPr>
+            <w:tcW w:type="dxa" w:w="1800"/>
+            <w:tcBorders>
+              <w:top w:val="single" w:color="D0D3D6" w:sz="4"/>
+              <w:left w:val="single" w:color="D0D3D6" w:sz="4"/>
+              <w:bottom w:val="single" w:color="D0D3D6" w:sz="4"/>
+              <w:right w:val="single" w:color="D0D3D6" w:sz="4"/>
+            </w:tcBorders>
+            <w:tcMar>
+              <w:top w:type="dxa" w:w="50"/>
+              <w:left w:type="dxa" w:w="80"/>
+              <w:bottom w:type="dxa" w:w="50"/>
+              <w:right w:type="dxa" w:w="80"/>
+            </w:tcMar>
+          </w:tcPr>
+          <w:p>
+            <w:pPr>
+              <w:jc w:val="center"/>
+            </w:pPr>
+            <w:r>
+              <w:rPr>
+                <w:rFonts w:ascii="Open Sans" w:cs="Open Sans" w:eastAsia="Open Sans" w:hAnsi="Open Sans"/>
+                <w:color w:val="333C46"/>
+                <w:sz w:val="16"/>
+                <w:szCs w:val="16"/>
+              </w:rPr>
+              <w:t xml:space="preserve">34.6 / 24.7 / 40.7</w:t>
+            </w:r>
+          </w:p>
+        </w:tc>
+        <w:tc>
+          <w:tcPr>
+            <w:tcW w:type="dxa" w:w="1000"/>
+            <w:tcBorders>
+              <w:top w:val="single" w:color="D0D3D6" w:sz="4"/>
+              <w:left w:val="single" w:color="D0D3D6" w:sz="4"/>
+              <w:bottom w:val="single" w:color="D0D3D6" w:sz="4"/>
+              <w:right w:val="single" w:color="D0D3D6" w:sz="4"/>
+            </w:tcBorders>
+            <w:tcMar>
+              <w:top w:type="dxa" w:w="50"/>
+              <w:left w:type="dxa" w:w="80"/>
+              <w:bottom w:type="dxa" w:w="50"/>
+              <w:right w:type="dxa" w:w="80"/>
+            </w:tcMar>
+          </w:tcPr>
+          <w:p>
+            <w:pPr>
+              <w:jc w:val="center"/>
+            </w:pPr>
+            <w:r>
+              <w:rPr>
+                <w:rFonts w:ascii="Open Sans" w:cs="Open Sans" w:eastAsia="Open Sans" w:hAnsi="Open Sans"/>
+                <w:color w:val="333C46"/>
+                <w:sz w:val="16"/>
+                <w:szCs w:val="16"/>
+              </w:rPr>
+              <w:t xml:space="preserve">Away</w:t>
+            </w:r>
+          </w:p>
+        </w:tc>
+        <w:tc>
+          <w:tcPr>
+            <w:tcW w:type="dxa" w:w="1000"/>
+            <w:tcBorders>
+              <w:top w:val="single" w:color="D0D3D6" w:sz="4"/>
+              <w:left w:val="single" w:color="D0D3D6" w:sz="4"/>
+              <w:bottom w:val="single" w:color="D0D3D6" w:sz="4"/>
+              <w:right w:val="single" w:color="D0D3D6" w:sz="4"/>
+            </w:tcBorders>
+            <w:tcMar>
+              <w:top w:type="dxa" w:w="50"/>
+              <w:left w:type="dxa" w:w="80"/>
+              <w:bottom w:type="dxa" w:w="50"/>
+              <w:right w:type="dxa" w:w="80"/>
+            </w:tcMar>
+          </w:tcPr>
+          <w:p>
+            <w:pPr>
+              <w:jc w:val="center"/>
+            </w:pPr>
+            <w:r>
+              <w:rPr>
+                <w:rFonts w:ascii="Open Sans" w:cs="Open Sans" w:eastAsia="Open Sans" w:hAnsi="Open Sans"/>
+                <w:color w:val="333C46"/>
+                <w:sz w:val="16"/>
+                <w:szCs w:val="16"/>
+              </w:rPr>
+              <w:t xml:space="preserve">Away</w:t>
+            </w:r>
+          </w:p>
+        </w:tc>
+        <w:tc>
+          <w:tcPr>
+            <w:tcW w:type="dxa" w:w="1700"/>
+            <w:tcBorders>
+              <w:top w:val="single" w:color="D0D3D6" w:sz="4"/>
+              <w:left w:val="single" w:color="D0D3D6" w:sz="4"/>
+              <w:bottom w:val="single" w:color="D0D3D6" w:sz="4"/>
+              <w:right w:val="single" w:color="D0D3D6" w:sz="4"/>
+            </w:tcBorders>
+            <w:tcMar>
+              <w:top w:type="dxa" w:w="50"/>
+              <w:left w:type="dxa" w:w="80"/>
+              <w:bottom w:type="dxa" w:w="50"/>
+              <w:right w:type="dxa" w:w="80"/>
+            </w:tcMar>
+          </w:tcPr>
+          <w:p>
+            <w:pPr>
+              <w:jc w:val="center"/>
+            </w:pPr>
+            <w:r>
+              <w:rPr>
+                <w:rFonts w:ascii="Open Sans" w:cs="Open Sans" w:eastAsia="Open Sans" w:hAnsi="Open Sans"/>
+                <w:b/>
+                <w:bCs/>
+                <w:color w:val="333C46"/>
+                <w:sz w:val="16"/>
+                <w:szCs w:val="16"/>
+              </w:rPr>
+              <w:t xml:space="preserve">Away 1-2</w:t>
+            </w:r>
+          </w:p>
+        </w:tc>
+        <w:tc>
+          <w:tcPr>
+            <w:tcW w:type="dxa" w:w="1300"/>
+            <w:tcBorders>
+              <w:top w:val="single" w:color="D0D3D6" w:sz="4"/>
+              <w:left w:val="single" w:color="D0D3D6" w:sz="4"/>
+              <w:bottom w:val="single" w:color="D0D3D6" w:sz="4"/>
+              <w:right w:val="single" w:color="D0D3D6" w:sz="4"/>
+            </w:tcBorders>
+            <w:shd w:fill="E3F6EC" w:color="auto" w:val="clear"/>
+            <w:tcMar>
+              <w:top w:type="dxa" w:w="50"/>
+              <w:left w:type="dxa" w:w="80"/>
+              <w:bottom w:type="dxa" w:w="50"/>
+              <w:right w:type="dxa" w:w="80"/>
+            </w:tcMar>
+          </w:tcPr>
+          <w:p>
+            <w:pPr>
+              <w:jc w:val="center"/>
+            </w:pPr>
+            <w:r>
+              <w:rPr>
+                <w:rFonts w:ascii="Open Sans" w:cs="Open Sans" w:eastAsia="Open Sans" w:hAnsi="Open Sans"/>
+                <w:color w:val="333C46"/>
+                <w:sz w:val="16"/>
+                <w:szCs w:val="16"/>
+              </w:rPr>
+              <w:t xml:space="preserve">Yes</w:t>
+            </w:r>
+          </w:p>
+        </w:tc>
+      </w:tr>
+      <w:tr>
+        <w:tc>
+          <w:tcPr>
+            <w:tcW w:type="dxa" w:w="2838"/>
+            <w:tcBorders>
+              <w:top w:val="single" w:color="D0D3D6" w:sz="4"/>
+              <w:left w:val="single" w:color="D0D3D6" w:sz="4"/>
+              <w:bottom w:val="single" w:color="D0D3D6" w:sz="4"/>
+              <w:right w:val="single" w:color="D0D3D6" w:sz="4"/>
+            </w:tcBorders>
+            <w:shd w:fill="F6F8FA" w:color="auto" w:val="clear"/>
+            <w:tcMar>
+              <w:top w:type="dxa" w:w="50"/>
+              <w:left w:type="dxa" w:w="80"/>
+              <w:bottom w:type="dxa" w:w="50"/>
+              <w:right w:type="dxa" w:w="80"/>
+            </w:tcMar>
+          </w:tcPr>
+          <w:p>
+            <w:pPr>
+              <w:jc w:val="left"/>
+            </w:pPr>
+            <w:r>
+              <w:rPr>
+                <w:rFonts w:ascii="Open Sans" w:cs="Open Sans" w:eastAsia="Open Sans" w:hAnsi="Open Sans"/>
+                <w:color w:val="333C46"/>
+                <w:sz w:val="16"/>
+                <w:szCs w:val="16"/>
+              </w:rPr>
+              <w:t xml:space="preserve">Coventry v Newcastle</w:t>
+            </w:r>
+          </w:p>
+        </w:tc>
+        <w:tc>
+          <w:tcPr>
+            <w:tcW w:type="dxa" w:w="1800"/>
+            <w:tcBorders>
+              <w:top w:val="single" w:color="D0D3D6" w:sz="4"/>
+              <w:left w:val="single" w:color="D0D3D6" w:sz="4"/>
+              <w:bottom w:val="single" w:color="D0D3D6" w:sz="4"/>
+              <w:right w:val="single" w:color="D0D3D6" w:sz="4"/>
+            </w:tcBorders>
+            <w:shd w:fill="F6F8FA" w:color="auto" w:val="clear"/>
+            <w:tcMar>
+              <w:top w:type="dxa" w:w="50"/>
+              <w:left w:type="dxa" w:w="80"/>
+              <w:bottom w:type="dxa" w:w="50"/>
+              <w:right w:type="dxa" w:w="80"/>
+            </w:tcMar>
+          </w:tcPr>
+          <w:p>
+            <w:pPr>
+              <w:jc w:val="center"/>
+            </w:pPr>
+            <w:r>
+              <w:rPr>
+                <w:rFonts w:ascii="Open Sans" w:cs="Open Sans" w:eastAsia="Open Sans" w:hAnsi="Open Sans"/>
+                <w:color w:val="333C46"/>
+                <w:sz w:val="16"/>
+                <w:szCs w:val="16"/>
+              </w:rPr>
+              <w:t xml:space="preserve">29.8 / 25.4 / 44.8</w:t>
+            </w:r>
+          </w:p>
+        </w:tc>
+        <w:tc>
+          <w:tcPr>
+            <w:tcW w:type="dxa" w:w="1000"/>
+            <w:tcBorders>
+              <w:top w:val="single" w:color="D0D3D6" w:sz="4"/>
+              <w:left w:val="single" w:color="D0D3D6" w:sz="4"/>
+              <w:bottom w:val="single" w:color="D0D3D6" w:sz="4"/>
+              <w:right w:val="single" w:color="D0D3D6" w:sz="4"/>
+            </w:tcBorders>
+            <w:shd w:fill="F6F8FA" w:color="auto" w:val="clear"/>
+            <w:tcMar>
+              <w:top w:type="dxa" w:w="50"/>
+              <w:left w:type="dxa" w:w="80"/>
+              <w:bottom w:type="dxa" w:w="50"/>
+              <w:right w:type="dxa" w:w="80"/>
+            </w:tcMar>
+          </w:tcPr>
+          <w:p>
+            <w:pPr>
+              <w:jc w:val="center"/>
+            </w:pPr>
+            <w:r>
+              <w:rPr>
+                <w:rFonts w:ascii="Open Sans" w:cs="Open Sans" w:eastAsia="Open Sans" w:hAnsi="Open Sans"/>
+                <w:color w:val="333C46"/>
+                <w:sz w:val="16"/>
+                <w:szCs w:val="16"/>
+              </w:rPr>
+              <w:t xml:space="preserve">Away</w:t>
+            </w:r>
+          </w:p>
+        </w:tc>
+        <w:tc>
+          <w:tcPr>
+            <w:tcW w:type="dxa" w:w="1000"/>
+            <w:tcBorders>
+              <w:top w:val="single" w:color="D0D3D6" w:sz="4"/>
+              <w:left w:val="single" w:color="D0D3D6" w:sz="4"/>
+              <w:bottom w:val="single" w:color="D0D3D6" w:sz="4"/>
+              <w:right w:val="single" w:color="D0D3D6" w:sz="4"/>
+            </w:tcBorders>
+            <w:shd w:fill="F6F8FA" w:color="auto" w:val="clear"/>
+            <w:tcMar>
+              <w:top w:type="dxa" w:w="50"/>
+              <w:left w:type="dxa" w:w="80"/>
+              <w:bottom w:type="dxa" w:w="50"/>
+              <w:right w:type="dxa" w:w="80"/>
+            </w:tcMar>
+          </w:tcPr>
+          <w:p>
+            <w:pPr>
+              <w:jc w:val="center"/>
+            </w:pPr>
+            <w:r>
+              <w:rPr>
+                <w:rFonts w:ascii="Open Sans" w:cs="Open Sans" w:eastAsia="Open Sans" w:hAnsi="Open Sans"/>
+                <w:color w:val="333C46"/>
+                <w:sz w:val="16"/>
+                <w:szCs w:val="16"/>
+              </w:rPr>
+              <w:t xml:space="preserve">Away</w:t>
+            </w:r>
+          </w:p>
+        </w:tc>
+        <w:tc>
+          <w:tcPr>
+            <w:tcW w:type="dxa" w:w="1700"/>
+            <w:tcBorders>
+              <w:top w:val="single" w:color="D0D3D6" w:sz="4"/>
+              <w:left w:val="single" w:color="D0D3D6" w:sz="4"/>
+              <w:bottom w:val="single" w:color="D0D3D6" w:sz="4"/>
+              <w:right w:val="single" w:color="D0D3D6" w:sz="4"/>
+            </w:tcBorders>
+            <w:shd w:fill="F6F8FA" w:color="auto" w:val="clear"/>
+            <w:tcMar>
+              <w:top w:type="dxa" w:w="50"/>
+              <w:left w:type="dxa" w:w="80"/>
+              <w:bottom w:type="dxa" w:w="50"/>
+              <w:right w:type="dxa" w:w="80"/>
+            </w:tcMar>
+          </w:tcPr>
+          <w:p>
+            <w:pPr>
+              <w:jc w:val="center"/>
+            </w:pPr>
+            <w:r>
+              <w:rPr>
+                <w:rFonts w:ascii="Open Sans" w:cs="Open Sans" w:eastAsia="Open Sans" w:hAnsi="Open Sans"/>
+                <w:b/>
+                <w:bCs/>
+                <w:color w:val="333C46"/>
+                <w:sz w:val="16"/>
+                <w:szCs w:val="16"/>
+              </w:rPr>
+              <w:t xml:space="preserve">Away 0-1</w:t>
+            </w:r>
+          </w:p>
+        </w:tc>
+        <w:tc>
+          <w:tcPr>
+            <w:tcW w:type="dxa" w:w="1300"/>
+            <w:tcBorders>
+              <w:top w:val="single" w:color="D0D3D6" w:sz="4"/>
+              <w:left w:val="single" w:color="D0D3D6" w:sz="4"/>
+              <w:bottom w:val="single" w:color="D0D3D6" w:sz="4"/>
+              <w:right w:val="single" w:color="D0D3D6" w:sz="4"/>
+            </w:tcBorders>
+            <w:shd w:fill="E3F6EC" w:color="auto" w:val="clear"/>
+            <w:tcMar>
+              <w:top w:type="dxa" w:w="50"/>
+              <w:left w:type="dxa" w:w="80"/>
+              <w:bottom w:type="dxa" w:w="50"/>
+              <w:right w:type="dxa" w:w="80"/>
+            </w:tcMar>
+          </w:tcPr>
+          <w:p>
+            <w:pPr>
+              <w:jc w:val="center"/>
+            </w:pPr>
+            <w:r>
+              <w:rPr>
+                <w:rFonts w:ascii="Open Sans" w:cs="Open Sans" w:eastAsia="Open Sans" w:hAnsi="Open Sans"/>
+                <w:color w:val="333C46"/>
+                <w:sz w:val="16"/>
+                <w:szCs w:val="16"/>
+              </w:rPr>
+              <w:t xml:space="preserve">Yes</w:t>
+            </w:r>
+          </w:p>
+        </w:tc>
+      </w:tr>
+    </w:tbl>
+    <w:p>
+      <w:pPr>
+        <w:spacing w:after="60" w:before="0" w:line="276"/>
+      </w:pPr>
+      <w:r>
+        <w:rPr>
+          <w:rFonts w:ascii="Open Sans" w:cs="Open Sans" w:eastAsia="Open Sans" w:hAnsi="Open Sans"/>
+          <w:color w:val="333C46"/>
+          <w:sz w:val="20"/>
+          <w:szCs w:val="20"/>
+        </w:rPr>
+        <w:t xml:space="preserve"/>
+      </w:r>
+    </w:p>
+    <w:p>
+      <w:pPr>
+        <w:spacing w:after="120" w:before="0" w:line="276"/>
+      </w:pPr>
+      <w:r>
+        <w:rPr>
+          <w:rFonts w:ascii="Open Sans" w:cs="Open Sans" w:eastAsia="Open Sans" w:hAnsi="Open Sans"/>
+          <w:color w:val="333C46"/>
+          <w:sz w:val="20"/>
+          <w:szCs w:val="20"/>
+        </w:rPr>
+        <w:t xml:space="preserve">Opta's Method 1 calls no draws and its Method 2 calls one (Crystal Palace v Nottingham Forest). Our forecast differs from Opta's Method 2 in two matches, Ipswich v Fulham and Aston Villa v Brentford. In both, Opta makes the home side clear favourites (45% and 48%) while the betting market narrowly prefers the away side. Our blend lands below 40% for the home side in both, so we call draws. These two matches will be the clearest test of whether Opta's home lean or the market's view is right.</w:t>
       </w:r>
     </w:p>
     <w:p>
@@ -7531,7 +9756,7 @@
           <w:sz w:val="20"/>
           <w:szCs w:val="20"/>
         </w:rPr>
-        <w:t xml:space="preserve">From Matchweek 6 onwards, capture Opta's figures each week before the page is overwritten. This turns the comparison into a clean, prospective test.</w:t>
+        <w:t xml:space="preserve">Keep capturing Opta's figures each week before the page is overwritten, as has now been done for Matchweek 6 (work/opta_mw/mw6.csv). This turns the comparison into a clean, forward-looking test.</w:t>
       </w:r>
     </w:p>
     <w:p>

</xml_diff>